<commit_message>
feat: Add collaborateur management page with PM/company type selector and detail views
</commit_message>
<xml_diff>
--- a/dossiers_dom/2026-05-19_SARL-AU_DOURIYA/SARL AU_2026-05-19_Depot-Legal-Constitution_DOURIYA.docx
+++ b/dossiers_dom/2026-05-19_SARL-AU_DOURIYA/SARL AU_2026-05-19_Depot-Legal-Constitution_DOURIYA.docx
@@ -1,67 +1,6 @@
 
-<file path=docProps\app.xml><?xml version="1.0" encoding="utf-8"?>
-<Properties xmlns="http://schemas.openxmlformats.org/officeDocument/2006/extended-properties" xmlns:vt="http://schemas.openxmlformats.org/officeDocument/2006/docPropsVTypes">
-  <Template>Normal.dotm</Template>
-  <TotalTime>12</TotalTime>
-  <Pages>1</Pages>
-  <Words>305</Words>
-  <Characters>1743</Characters>
-  <Application>Microsoft Office Word</Application>
-  <DocSecurity>0</DocSecurity>
-  <Lines>14</Lines>
-  <Paragraphs>4</Paragraphs>
-  <ScaleCrop>false</ScaleCrop>
-  <Company/>
-  <LinksUpToDate>false</LinksUpToDate>
-  <CharactersWithSpaces>2044</CharactersWithSpaces>
-  <SharedDoc>false</SharedDoc>
-  <HyperlinksChanged>false</HyperlinksChanged>
-  <AppVersion>16.0000</AppVersion>
-</Properties>
-</file>
-
-<file path=docProps\core.xml><?xml version="1.0" encoding="utf-8"?>
-<cp:coreProperties xmlns:cp="http://schemas.openxmlformats.org/package/2006/metadata/core-properties" xmlns:dc="http://purl.org/dc/elements/1.1/" xmlns:dcterms="http://purl.org/dc/terms/" xmlns:dcmitype="http://purl.org/dc/dcmitype/" xmlns:xsi="http://www.w3.org/2001/XMLSchema-instance">
-  <dc:title/>
-  <dc:subject/>
-  <dc:creator>Abdeljalil Rihana</dc:creator>
-  <cp:keywords/>
-  <dc:description/>
-  <cp:lastModifiedBy>ABDELJALIL RIHANA</cp:lastModifiedBy>
-  <cp:revision>4</cp:revision>
-  <dcterms:created xsi:type="dcterms:W3CDTF">2023-09-05T21:17:00Z</dcterms:created>
-  <dcterms:modified xsi:type="dcterms:W3CDTF">2024-03-19T21:37:00Z</dcterms:modified>
-</cp:coreProperties>
-</file>
-
-<file path=docProps\custom.xml><?xml version="1.0" encoding="utf-8"?>
-<Properties xmlns="http://schemas.openxmlformats.org/officeDocument/2006/custom-properties" xmlns:vt="http://schemas.openxmlformats.org/officeDocument/2006/docPropsVTypes">
-  <property fmtid="{D5CDD505-2E9C-101B-9397-08002B2CF9AE}" pid="2" name="MSIP_Label_defa4170-0d19-0005-0004-bc88714345d2_Enabled">
-    <vt:lpwstr>true</vt:lpwstr>
-  </property>
-  <property fmtid="{D5CDD505-2E9C-101B-9397-08002B2CF9AE}" pid="3" name="MSIP_Label_defa4170-0d19-0005-0004-bc88714345d2_SetDate">
-    <vt:lpwstr>2023-09-05T21:25:05Z</vt:lpwstr>
-  </property>
-  <property fmtid="{D5CDD505-2E9C-101B-9397-08002B2CF9AE}" pid="4" name="MSIP_Label_defa4170-0d19-0005-0004-bc88714345d2_Method">
-    <vt:lpwstr>Standard</vt:lpwstr>
-  </property>
-  <property fmtid="{D5CDD505-2E9C-101B-9397-08002B2CF9AE}" pid="5" name="MSIP_Label_defa4170-0d19-0005-0004-bc88714345d2_Name">
-    <vt:lpwstr>defa4170-0d19-0005-0004-bc88714345d2</vt:lpwstr>
-  </property>
-  <property fmtid="{D5CDD505-2E9C-101B-9397-08002B2CF9AE}" pid="6" name="MSIP_Label_defa4170-0d19-0005-0004-bc88714345d2_SiteId">
-    <vt:lpwstr>989c0c80-f26d-42fa-9eac-773d83b0c66e</vt:lpwstr>
-  </property>
-  <property fmtid="{D5CDD505-2E9C-101B-9397-08002B2CF9AE}" pid="7" name="MSIP_Label_defa4170-0d19-0005-0004-bc88714345d2_ActionId">
-    <vt:lpwstr>43294c63-de80-4906-a9e3-8d0d6d4fd116</vt:lpwstr>
-  </property>
-  <property fmtid="{D5CDD505-2E9C-101B-9397-08002B2CF9AE}" pid="8" name="MSIP_Label_defa4170-0d19-0005-0004-bc88714345d2_ContentBits">
-    <vt:lpwstr>0</vt:lpwstr>
-  </property>
-</Properties>
-</file>
-
-<file path=word\document.xml><?xml version="1.0" encoding="utf-8"?>
-<w:document xmlns:wpc="http://schemas.microsoft.com/office/word/2010/wordprocessingCanvas" xmlns:cx="http://schemas.microsoft.com/office/drawing/2014/chartex" xmlns:cx1="http://schemas.microsoft.com/office/drawing/2015/9/8/chartex" xmlns:cx2="http://schemas.microsoft.com/office/drawing/2015/10/21/chartex" xmlns:cx3="http://schemas.microsoft.com/office/drawing/2016/5/9/chartex" xmlns:cx4="http://schemas.microsoft.com/office/drawing/2016/5/10/chartex" xmlns:cx5="http://schemas.microsoft.com/office/drawing/2016/5/11/chartex" xmlns:cx6="http://schemas.microsoft.com/office/drawing/2016/5/12/chartex" xmlns:cx7="http://schemas.microsoft.com/office/drawing/2016/5/13/chartex" xmlns:cx8="http://schemas.microsoft.com/office/drawing/2016/5/14/chartex" xmlns:mc="http://schemas.openxmlformats.org/markup-compatibility/2006" xmlns:aink="http://schemas.microsoft.com/office/drawing/2016/ink" xmlns:am3d="http://schemas.microsoft.com/office/drawing/2017/model3d" xmlns:o="urn:schemas-microsoft-com:office:office" xmlns:oel="http://schemas.microsoft.com/office/2019/extlst" xmlns:r="http://schemas.openxmlformats.org/officeDocument/2006/relationships" xmlns:m="http://schemas.openxmlformats.org/officeDocument/2006/math" xmlns:v="urn:schemas-microsoft-com:vml" xmlns:wp14="http://schemas.microsoft.com/office/word/2010/wordprocessingDrawing" xmlns:wp="http://schemas.openxmlformats.org/drawingml/2006/wordprocessingDrawing" xmlns:w10="urn:schemas-microsoft-com:office:word" xmlns:w="http://schemas.openxmlformats.org/wordprocessingml/2006/main" xmlns:w14="http://schemas.microsoft.com/office/word/2010/wordml" xmlns:w15="http://schemas.microsoft.com/office/word/2012/wordml" xmlns:w16cex="http://schemas.microsoft.com/office/word/2018/wordml/cex" xmlns:w16cid="http://schemas.microsoft.com/office/word/2016/wordml/cid" xmlns:w16="http://schemas.microsoft.com/office/word/2018/wordml" xmlns:w16sdtdh="http://schemas.microsoft.com/office/word/2020/wordml/sdtdatahash" xmlns:w16se="http://schemas.microsoft.com/office/word/2015/wordml/symex" xmlns:wpg="http://schemas.microsoft.com/office/word/2010/wordprocessingGroup" xmlns:wpi="http://schemas.microsoft.com/office/word/2010/wordprocessingInk" xmlns:wne="http://schemas.microsoft.com/office/word/2006/wordml" xmlns:wps="http://schemas.microsoft.com/office/word/2010/wordprocessingShape" mc:Ignorable="w14 w15 w16se w16cid w16 w16cex w16sdtdh wp14">
+<file path=word/document.xml><?xml version="1.0" encoding="utf-8"?>
+<w:document xmlns:wpc="http://schemas.microsoft.com/office/word/2010/wordprocessingCanvas" xmlns:cx="http://schemas.microsoft.com/office/drawing/2014/chartex" xmlns:cx1="http://schemas.microsoft.com/office/drawing/2015/9/8/chartex" xmlns:cx2="http://schemas.microsoft.com/office/drawing/2015/10/21/chartex" xmlns:cx3="http://schemas.microsoft.com/office/drawing/2016/5/9/chartex" xmlns:cx4="http://schemas.microsoft.com/office/drawing/2016/5/10/chartex" xmlns:cx5="http://schemas.microsoft.com/office/drawing/2016/5/11/chartex" xmlns:cx6="http://schemas.microsoft.com/office/drawing/2016/5/12/chartex" xmlns:cx7="http://schemas.microsoft.com/office/drawing/2016/5/13/chartex" xmlns:cx8="http://schemas.microsoft.com/office/drawing/2016/5/14/chartex" xmlns:mc="http://schemas.openxmlformats.org/markup-compatibility/2006" xmlns:aink="http://schemas.microsoft.com/office/drawing/2016/ink" xmlns:am3d="http://schemas.microsoft.com/office/drawing/2017/model3d" xmlns:o="urn:schemas-microsoft-com:office:office" xmlns:oel="http://schemas.microsoft.com/office/2019/extlst" xmlns:r="http://schemas.openxmlformats.org/officeDocument/2006/relationships" xmlns:m="http://schemas.openxmlformats.org/officeDocument/2006/math" xmlns:v="urn:schemas-microsoft-com:vml" xmlns:wp14="http://schemas.microsoft.com/office/word/2010/wordprocessingDrawing" xmlns:wp="http://schemas.openxmlformats.org/drawingml/2006/wordprocessingDrawing" xmlns:w10="urn:schemas-microsoft-com:office:word" xmlns:w="http://schemas.openxmlformats.org/wordprocessingml/2006/main" xmlns:w14="http://schemas.microsoft.com/office/word/2010/wordml" xmlns:w15="http://schemas.microsoft.com/office/word/2012/wordml" xmlns:w16cex="http://schemas.microsoft.com/office/word/2018/wordml/cex" xmlns:w16cid="http://schemas.microsoft.com/office/word/2016/wordml/cid" xmlns:w16="http://schemas.microsoft.com/office/word/2018/wordml" xmlns:w16du="http://schemas.microsoft.com/office/word/2023/wordml/word16du" xmlns:w16sdtdh="http://schemas.microsoft.com/office/word/2020/wordml/sdtdatahash" xmlns:w16sdtfl="http://schemas.microsoft.com/office/word/2024/wordml/sdtformatlock" xmlns:w16se="http://schemas.microsoft.com/office/word/2015/wordml/symex" xmlns:wpg="http://schemas.microsoft.com/office/word/2010/wordprocessingGroup" xmlns:wpi="http://schemas.microsoft.com/office/word/2010/wordprocessingInk" xmlns:wne="http://schemas.microsoft.com/office/word/2006/wordml" xmlns:wps="http://schemas.microsoft.com/office/word/2010/wordprocessingShape" mc:Ignorable="w14 w15 w16se w16cid w16 w16cex w16sdtdh w16sdtfl w16du wp14">
   <w:body>
     <w:p>
       <w:pPr>
@@ -402,14 +341,7 @@
           <w:rFonts w:ascii="Aptos" w:hAnsi="Aptos"/>
           <w:b/>
         </w:rPr>
-        <w:t xml:space="preserve">HAY MOULAY ABDELLAH RUE 300 N 152 ETG 2 AIN CHOCK, CASABLANCA </w:t>
-      </w:r>
-      <w:r>
-        <w:rPr>
-          <w:rFonts w:ascii="Aptos" w:hAnsi="Aptos"/>
-          <w:b/>
-        </w:rPr>
-        <w:t>Casablanca</w:t>
+        <w:t>HAY MOULAY ABDELLAH RUE 300 N 152 ETG 2 AIN CHOCK, CASABLANCA</w:t>
       </w:r>
     </w:p>
     <w:p>
@@ -2381,109 +2313,8 @@
 </w:document>
 </file>
 
-<file path=word\fontTable.xml><?xml version="1.0" encoding="utf-8"?>
-<w:fonts xmlns:mc="http://schemas.openxmlformats.org/markup-compatibility/2006" xmlns:r="http://schemas.openxmlformats.org/officeDocument/2006/relationships" xmlns:w="http://schemas.openxmlformats.org/wordprocessingml/2006/main" xmlns:w14="http://schemas.microsoft.com/office/word/2010/wordml" xmlns:w15="http://schemas.microsoft.com/office/word/2012/wordml" xmlns:w16cex="http://schemas.microsoft.com/office/word/2018/wordml/cex" xmlns:w16cid="http://schemas.microsoft.com/office/word/2016/wordml/cid" xmlns:w16="http://schemas.microsoft.com/office/word/2018/wordml" xmlns:w16sdtdh="http://schemas.microsoft.com/office/word/2020/wordml/sdtdatahash" xmlns:w16se="http://schemas.microsoft.com/office/word/2015/wordml/symex" mc:Ignorable="w14 w15 w16se w16cid w16 w16cex w16sdtdh">
-  <w:font w:name="Times New Roman">
-    <w:panose1 w:val="02020603050405020304"/>
-    <w:charset w:val="00"/>
-    <w:family w:val="roman"/>
-    <w:pitch w:val="variable"/>
-    <w:sig w:usb0="E0002EFF" w:usb1="C000785B" w:usb2="00000009" w:usb3="00000000" w:csb0="000001FF" w:csb1="00000000"/>
-  </w:font>
-  <w:font w:name="Tw Cen MT">
-    <w:panose1 w:val="020B0602020104020603"/>
-    <w:charset w:val="00"/>
-    <w:family w:val="swiss"/>
-    <w:pitch w:val="variable"/>
-    <w:sig w:usb0="00000007" w:usb1="00000000" w:usb2="00000000" w:usb3="00000000" w:csb0="00000003" w:csb1="00000000"/>
-  </w:font>
-  <w:font w:name="Arial">
-    <w:panose1 w:val="020B0604020202020204"/>
-    <w:charset w:val="00"/>
-    <w:family w:val="swiss"/>
-    <w:pitch w:val="variable"/>
-    <w:sig w:usb0="E0002EFF" w:usb1="C000785B" w:usb2="00000009" w:usb3="00000000" w:csb0="000001FF" w:csb1="00000000"/>
-  </w:font>
-  <w:font w:name="AL-Battar">
-    <w:altName w:val="Arial"/>
-    <w:charset w:val="B2"/>
-    <w:family w:val="auto"/>
-    <w:pitch w:val="variable"/>
-    <w:sig w:usb0="00002001" w:usb1="00000000" w:usb2="00000000" w:usb3="00000000" w:csb0="00000040" w:csb1="00000000"/>
-  </w:font>
-  <w:font w:name="Hesham Bold">
-    <w:altName w:val="Arial"/>
-    <w:charset w:val="B2"/>
-    <w:family w:val="auto"/>
-    <w:pitch w:val="variable"/>
-    <w:sig w:usb0="00002001" w:usb1="00000000" w:usb2="00000000" w:usb3="00000000" w:csb0="00000040" w:csb1="00000000"/>
-  </w:font>
-  <w:font w:name="Aptos">
-    <w:charset w:val="00"/>
-    <w:family w:val="swiss"/>
-    <w:pitch w:val="variable"/>
-    <w:sig w:usb0="20000287" w:usb1="00000003" w:usb2="00000000" w:usb3="00000000" w:csb0="0000019F" w:csb1="00000000"/>
-  </w:font>
-  <w:font w:name="Al-Mothnna">
-    <w:altName w:val="Arial"/>
-    <w:charset w:val="B2"/>
-    <w:family w:val="auto"/>
-    <w:pitch w:val="variable"/>
-    <w:sig w:usb0="00002001" w:usb1="00000000" w:usb2="00000000" w:usb3="00000000" w:csb0="00000040" w:csb1="00000000"/>
-  </w:font>
-  <w:font w:name="SKR HEAD1">
-    <w:altName w:val="Arial"/>
-    <w:charset w:val="B2"/>
-    <w:family w:val="auto"/>
-    <w:pitch w:val="variable"/>
-    <w:sig w:usb0="00002001" w:usb1="00000000" w:usb2="00000000" w:usb3="00000000" w:csb0="00000040" w:csb1="00000000"/>
-  </w:font>
-  <w:font w:name="AL-Hor">
-    <w:charset w:val="B2"/>
-    <w:family w:val="auto"/>
-    <w:pitch w:val="variable"/>
-    <w:sig w:usb0="00002001" w:usb1="00000000" w:usb2="00000000" w:usb3="00000000" w:csb0="00000040" w:csb1="00000000"/>
-  </w:font>
-  <w:font w:name="Book Antiqua">
-    <w:panose1 w:val="02040602050305030304"/>
-    <w:charset w:val="00"/>
-    <w:family w:val="roman"/>
-    <w:pitch w:val="variable"/>
-    <w:sig w:usb0="00000287" w:usb1="00000000" w:usb2="00000000" w:usb3="00000000" w:csb0="0000009F" w:csb1="00000000"/>
-  </w:font>
-  <w:font w:name="ae_AlMothnna">
-    <w:charset w:val="00"/>
-    <w:family w:val="swiss"/>
-    <w:pitch w:val="variable"/>
-    <w:sig w:usb0="800020AF" w:usb1="C000204A" w:usb2="00000008" w:usb3="00000000" w:csb0="00000041" w:csb1="00000000"/>
-  </w:font>
-  <w:font w:name="ATraditional Arabic">
-    <w:panose1 w:val="02020603050405020304"/>
-    <w:charset w:val="00"/>
-    <w:family w:val="roman"/>
-    <w:pitch w:val="variable"/>
-    <w:sig w:usb0="00002003" w:usb1="00000000" w:usb2="00000008" w:usb3="00000000" w:csb0="00000041" w:csb1="00000000"/>
-  </w:font>
-  <w:font w:name="Amiri Quran">
-    <w:altName w:val="Arial"/>
-    <w:panose1 w:val="00000500000000000000"/>
-    <w:charset w:val="B2"/>
-    <w:family w:val="auto"/>
-    <w:pitch w:val="variable"/>
-    <w:sig w:usb0="80002043" w:usb1="80002000" w:usb2="00000000" w:usb3="00000000" w:csb0="00000040" w:csb1="00000000"/>
-  </w:font>
-  <w:font w:name="Symbol">
-    <w:panose1 w:val="05050102010706020507"/>
-    <w:charset w:val="02"/>
-    <w:family w:val="roman"/>
-    <w:pitch w:val="variable"/>
-    <w:sig w:usb0="00000000" w:usb1="10000000" w:usb2="00000000" w:usb3="00000000" w:csb0="80000000" w:csb1="00000000"/>
-  </w:font>
-</w:fonts>
-</file>
-
-<file path=word\numbering.xml><?xml version="1.0" encoding="utf-8"?>
-<w:numbering xmlns:wpc="http://schemas.microsoft.com/office/word/2010/wordprocessingCanvas" xmlns:cx="http://schemas.microsoft.com/office/drawing/2014/chartex" xmlns:cx1="http://schemas.microsoft.com/office/drawing/2015/9/8/chartex" xmlns:cx2="http://schemas.microsoft.com/office/drawing/2015/10/21/chartex" xmlns:cx3="http://schemas.microsoft.com/office/drawing/2016/5/9/chartex" xmlns:cx4="http://schemas.microsoft.com/office/drawing/2016/5/10/chartex" xmlns:cx5="http://schemas.microsoft.com/office/drawing/2016/5/11/chartex" xmlns:cx6="http://schemas.microsoft.com/office/drawing/2016/5/12/chartex" xmlns:cx7="http://schemas.microsoft.com/office/drawing/2016/5/13/chartex" xmlns:cx8="http://schemas.microsoft.com/office/drawing/2016/5/14/chartex" xmlns:mc="http://schemas.openxmlformats.org/markup-compatibility/2006" xmlns:aink="http://schemas.microsoft.com/office/drawing/2016/ink" xmlns:am3d="http://schemas.microsoft.com/office/drawing/2017/model3d" xmlns:o="urn:schemas-microsoft-com:office:office" xmlns:oel="http://schemas.microsoft.com/office/2019/extlst" xmlns:r="http://schemas.openxmlformats.org/officeDocument/2006/relationships" xmlns:m="http://schemas.openxmlformats.org/officeDocument/2006/math" xmlns:v="urn:schemas-microsoft-com:vml" xmlns:wp14="http://schemas.microsoft.com/office/word/2010/wordprocessingDrawing" xmlns:wp="http://schemas.openxmlformats.org/drawingml/2006/wordprocessingDrawing" xmlns:w10="urn:schemas-microsoft-com:office:word" xmlns:w="http://schemas.openxmlformats.org/wordprocessingml/2006/main" xmlns:w14="http://schemas.microsoft.com/office/word/2010/wordml" xmlns:w15="http://schemas.microsoft.com/office/word/2012/wordml" xmlns:w16cex="http://schemas.microsoft.com/office/word/2018/wordml/cex" xmlns:w16cid="http://schemas.microsoft.com/office/word/2016/wordml/cid" xmlns:w16="http://schemas.microsoft.com/office/word/2018/wordml" xmlns:w16sdtdh="http://schemas.microsoft.com/office/word/2020/wordml/sdtdatahash" xmlns:w16se="http://schemas.microsoft.com/office/word/2015/wordml/symex" xmlns:wpg="http://schemas.microsoft.com/office/word/2010/wordprocessingGroup" xmlns:wpi="http://schemas.microsoft.com/office/word/2010/wordprocessingInk" xmlns:wne="http://schemas.microsoft.com/office/word/2006/wordml" xmlns:wps="http://schemas.microsoft.com/office/word/2010/wordprocessingShape" mc:Ignorable="w14 w15 w16se w16cid w16 w16cex w16sdtdh wp14">
+<file path=word/numbering.xml><?xml version="1.0" encoding="utf-8"?>
+<w:numbering xmlns:wpc="http://schemas.microsoft.com/office/word/2010/wordprocessingCanvas" xmlns:cx="http://schemas.microsoft.com/office/drawing/2014/chartex" xmlns:cx1="http://schemas.microsoft.com/office/drawing/2015/9/8/chartex" xmlns:cx2="http://schemas.microsoft.com/office/drawing/2015/10/21/chartex" xmlns:cx3="http://schemas.microsoft.com/office/drawing/2016/5/9/chartex" xmlns:cx4="http://schemas.microsoft.com/office/drawing/2016/5/10/chartex" xmlns:cx5="http://schemas.microsoft.com/office/drawing/2016/5/11/chartex" xmlns:cx6="http://schemas.microsoft.com/office/drawing/2016/5/12/chartex" xmlns:cx7="http://schemas.microsoft.com/office/drawing/2016/5/13/chartex" xmlns:cx8="http://schemas.microsoft.com/office/drawing/2016/5/14/chartex" xmlns:mc="http://schemas.openxmlformats.org/markup-compatibility/2006" xmlns:aink="http://schemas.microsoft.com/office/drawing/2016/ink" xmlns:am3d="http://schemas.microsoft.com/office/drawing/2017/model3d" xmlns:o="urn:schemas-microsoft-com:office:office" xmlns:oel="http://schemas.microsoft.com/office/2019/extlst" xmlns:r="http://schemas.openxmlformats.org/officeDocument/2006/relationships" xmlns:m="http://schemas.openxmlformats.org/officeDocument/2006/math" xmlns:v="urn:schemas-microsoft-com:vml" xmlns:wp14="http://schemas.microsoft.com/office/word/2010/wordprocessingDrawing" xmlns:wp="http://schemas.openxmlformats.org/drawingml/2006/wordprocessingDrawing" xmlns:w10="urn:schemas-microsoft-com:office:word" xmlns:w="http://schemas.openxmlformats.org/wordprocessingml/2006/main" xmlns:w14="http://schemas.microsoft.com/office/word/2010/wordml" xmlns:w15="http://schemas.microsoft.com/office/word/2012/wordml" xmlns:w16cex="http://schemas.microsoft.com/office/word/2018/wordml/cex" xmlns:w16cid="http://schemas.microsoft.com/office/word/2016/wordml/cid" xmlns:w16="http://schemas.microsoft.com/office/word/2018/wordml" xmlns:w16du="http://schemas.microsoft.com/office/word/2023/wordml/word16du" xmlns:w16sdtdh="http://schemas.microsoft.com/office/word/2020/wordml/sdtdatahash" xmlns:w16sdtfl="http://schemas.microsoft.com/office/word/2024/wordml/sdtformatlock" xmlns:w16se="http://schemas.microsoft.com/office/word/2015/wordml/symex" xmlns:wpg="http://schemas.microsoft.com/office/word/2010/wordprocessingGroup" xmlns:wpi="http://schemas.microsoft.com/office/word/2010/wordprocessingInk" xmlns:wne="http://schemas.microsoft.com/office/word/2006/wordml" xmlns:wps="http://schemas.microsoft.com/office/word/2010/wordprocessingShape" mc:Ignorable="w14 w15 w16se w16cid w16 w16cex w16sdtdh w16sdtfl w16du wp14">
   <w:abstractNum w:abstractNumId="0" w15:restartNumberingAfterBreak="0">
     <w:nsid w:val="3955304A"/>
     <w:multiLevelType w:val="hybridMultilevel"/>
@@ -2583,64 +2414,8 @@
 </w:numbering>
 </file>
 
-<file path=word\settings.xml><?xml version="1.0" encoding="utf-8"?>
-<w:settings xmlns:mc="http://schemas.openxmlformats.org/markup-compatibility/2006" xmlns:o="urn:schemas-microsoft-com:office:office" xmlns:r="http://schemas.openxmlformats.org/officeDocument/2006/relationships" xmlns:m="http://schemas.openxmlformats.org/officeDocument/2006/math" xmlns:v="urn:schemas-microsoft-com:vml" xmlns:w10="urn:schemas-microsoft-com:office:word" xmlns:w="http://schemas.openxmlformats.org/wordprocessingml/2006/main" xmlns:w14="http://schemas.microsoft.com/office/word/2010/wordml" xmlns:w15="http://schemas.microsoft.com/office/word/2012/wordml" xmlns:w16cex="http://schemas.microsoft.com/office/word/2018/wordml/cex" xmlns:w16cid="http://schemas.microsoft.com/office/word/2016/wordml/cid" xmlns:w16="http://schemas.microsoft.com/office/word/2018/wordml" xmlns:w16sdtdh="http://schemas.microsoft.com/office/word/2020/wordml/sdtdatahash" xmlns:w16se="http://schemas.microsoft.com/office/word/2015/wordml/symex" xmlns:sl="http://schemas.openxmlformats.org/schemaLibrary/2006/main" mc:Ignorable="w14 w15 w16se w16cid w16 w16cex w16sdtdh">
-  <w:zoom w:percent="180"/>
-  <w:defaultTabStop w:val="708"/>
-  <w:hyphenationZone w:val="425"/>
-  <w:characterSpacingControl w:val="doNotCompress"/>
-  <w:compat>
-    <w:compatSetting w:name="compatibilityMode" w:uri="http://schemas.microsoft.com/office/word" w:val="15"/>
-    <w:compatSetting w:name="overrideTableStyleFontSizeAndJustification" w:uri="http://schemas.microsoft.com/office/word" w:val="1"/>
-    <w:compatSetting w:name="enableOpenTypeFeatures" w:uri="http://schemas.microsoft.com/office/word" w:val="1"/>
-    <w:compatSetting w:name="doNotFlipMirrorIndents" w:uri="http://schemas.microsoft.com/office/word" w:val="1"/>
-    <w:compatSetting w:name="differentiateMultirowTableHeaders" w:uri="http://schemas.microsoft.com/office/word" w:val="1"/>
-    <w:compatSetting w:name="useWord2013TrackBottomHyphenation" w:uri="http://schemas.microsoft.com/office/word" w:val="0"/>
-  </w:compat>
-  <w:rsids>
-    <w:rsidRoot w:val="00006852"/>
-    <w:rsid w:val="00006852"/>
-    <w:rsid w:val="001A21D1"/>
-    <w:rsid w:val="00246C1F"/>
-    <w:rsid w:val="004D2673"/>
-    <w:rsid w:val="004D2922"/>
-    <w:rsid w:val="00BA6D30"/>
-    <w:rsid w:val="00D4523D"/>
-    <w:rsid w:val="00F36CFE"/>
-    <w:rsid w:val="00FB0A1D"/>
-  </w:rsids>
-  <m:mathPr>
-    <m:mathFont m:val="Cambria Math"/>
-    <m:brkBin m:val="before"/>
-    <m:brkBinSub m:val="--"/>
-    <m:smallFrac m:val="0"/>
-    <m:dispDef/>
-    <m:lMargin m:val="0"/>
-    <m:rMargin m:val="0"/>
-    <m:defJc m:val="centerGroup"/>
-    <m:wrapIndent m:val="1440"/>
-    <m:intLim m:val="subSup"/>
-    <m:naryLim m:val="undOvr"/>
-  </m:mathPr>
-  <w:themeFontLang w:val="fr-FR" w:bidi="ar-SA"/>
-  <w:clrSchemeMapping w:bg1="light1" w:t1="dark1" w:bg2="light2" w:t2="dark2" w:accent1="accent1" w:accent2="accent2" w:accent3="accent3" w:accent4="accent4" w:accent5="accent5" w:accent6="accent6" w:hyperlink="hyperlink" w:followedHyperlink="followedHyperlink"/>
-  <w:smartTagType w:namespaceuri="urn:schemas-microsoft-com:office:smarttags" w:name="PersonName"/>
-  <w:shapeDefaults>
-    <o:shapedefaults v:ext="edit" spidmax="1026"/>
-    <o:shapelayout v:ext="edit">
-      <o:idmap v:ext="edit" data="1"/>
-    </o:shapelayout>
-  </w:shapeDefaults>
-  <w:decimalSymbol w:val=","/>
-  <w:listSeparator w:val=";"/>
-  <w14:docId w14:val="0A7B90F1"/>
-  <w15:chartTrackingRefBased/>
-  <w15:docId w15:val="{91664D84-C235-4D1D-A2CC-98538A150BB3}"/>
-</w:settings>
-</file>
-
-<file path=word\styles.xml><?xml version="1.0" encoding="utf-8"?>
-<w:styles xmlns:mc="http://schemas.openxmlformats.org/markup-compatibility/2006" xmlns:r="http://schemas.openxmlformats.org/officeDocument/2006/relationships" xmlns:w="http://schemas.openxmlformats.org/wordprocessingml/2006/main" xmlns:w14="http://schemas.microsoft.com/office/word/2010/wordml" xmlns:w15="http://schemas.microsoft.com/office/word/2012/wordml" xmlns:w16cex="http://schemas.microsoft.com/office/word/2018/wordml/cex" xmlns:w16cid="http://schemas.microsoft.com/office/word/2016/wordml/cid" xmlns:w16="http://schemas.microsoft.com/office/word/2018/wordml" xmlns:w16sdtdh="http://schemas.microsoft.com/office/word/2020/wordml/sdtdatahash" xmlns:w16se="http://schemas.microsoft.com/office/word/2015/wordml/symex" mc:Ignorable="w14 w15 w16se w16cid w16 w16cex w16sdtdh">
+<file path=word/styles.xml><?xml version="1.0" encoding="utf-8"?>
+<w:styles xmlns:mc="http://schemas.openxmlformats.org/markup-compatibility/2006" xmlns:r="http://schemas.openxmlformats.org/officeDocument/2006/relationships" xmlns:w="http://schemas.openxmlformats.org/wordprocessingml/2006/main" xmlns:w14="http://schemas.microsoft.com/office/word/2010/wordml" xmlns:w15="http://schemas.microsoft.com/office/word/2012/wordml" xmlns:w16cex="http://schemas.microsoft.com/office/word/2018/wordml/cex" xmlns:w16cid="http://schemas.microsoft.com/office/word/2016/wordml/cid" xmlns:w16="http://schemas.microsoft.com/office/word/2018/wordml" xmlns:w16du="http://schemas.microsoft.com/office/word/2023/wordml/word16du" xmlns:w16sdtdh="http://schemas.microsoft.com/office/word/2020/wordml/sdtdatahash" xmlns:w16sdtfl="http://schemas.microsoft.com/office/word/2024/wordml/sdtformatlock" xmlns:w16se="http://schemas.microsoft.com/office/word/2015/wordml/symex" mc:Ignorable="w14 w15 w16se w16cid w16 w16cex w16sdtdh w16sdtfl w16du">
   <w:docDefaults>
     <w:rPrDefault>
       <w:rPr>
@@ -3485,14 +3260,6 @@
       <w:b/>
       <w:bCs/>
       <w:color w:val="31479E" w:themeColor="accent1" w:themeShade="BF"/>
-      <w14:textFill>
-        <w14:solidFill>
-          <w14:schemeClr w14:val="accent1">
-            <w14:lumMod w14:val="75000"/>
-            <w14:lumMod w14:val="75000"/>
-          </w14:schemeClr>
-        </w14:solidFill>
-      </w14:textFill>
     </w:rPr>
   </w:style>
   <w:style w:type="character" w:customStyle="1" w:styleId="Car4">
@@ -3668,7 +3435,7 @@
 </w:styles>
 </file>
 
-<file path=word\theme\theme1.xml><?xml version="1.0" encoding="utf-8"?>
+<file path=word/theme/theme1.xml><?xml version="1.0" encoding="utf-8"?>
 <a:theme xmlns:a="http://schemas.openxmlformats.org/drawingml/2006/main" name="Circuit">
   <a:themeElements>
     <a:clrScheme name="Sillage">
@@ -3917,11 +3684,4 @@
     </a:ext>
   </a:extLst>
 </a:theme>
-</file>
-
-<file path=word\webSettings.xml><?xml version="1.0" encoding="utf-8"?>
-<w:webSettings xmlns:mc="http://schemas.openxmlformats.org/markup-compatibility/2006" xmlns:r="http://schemas.openxmlformats.org/officeDocument/2006/relationships" xmlns:w="http://schemas.openxmlformats.org/wordprocessingml/2006/main" xmlns:w14="http://schemas.microsoft.com/office/word/2010/wordml" xmlns:w15="http://schemas.microsoft.com/office/word/2012/wordml" xmlns:w16cex="http://schemas.microsoft.com/office/word/2018/wordml/cex" xmlns:w16cid="http://schemas.microsoft.com/office/word/2016/wordml/cid" xmlns:w16="http://schemas.microsoft.com/office/word/2018/wordml" xmlns:w16sdtdh="http://schemas.microsoft.com/office/word/2020/wordml/sdtdatahash" xmlns:w16se="http://schemas.microsoft.com/office/word/2015/wordml/symex" mc:Ignorable="w14 w15 w16se w16cid w16 w16cex w16sdtdh">
-  <w:optimizeForBrowser/>
-  <w:allowPNG/>
-</w:webSettings>
 </file>
</xml_diff>